<commit_message>
fix: remove practice exam slide (no practice exam for this course)
Co-Authored-By: Claude Opus 5.5 <noreply@anthropic.com>
</commit_message>
<xml_diff>
--- a/courseware/FG-Agentic AI for Video Creation.docx
+++ b/courseware/FG-Agentic AI for Video Creation.docx
@@ -790,7 +790,7 @@
           <w:b w:val="0"/>
           <w:sz w:val="19"/>
         </w:rPr>
-        <w:t>Topic 3 — Workflow Optimisation, Industry Compliance and Emerging Video Technologies (LU3, Slides 98–137)</w:t>
+        <w:t>Topic 3 — Workflow Optimisation, Industry Compliance and Emerging Video Technologies (LU3, Slides 98–136)</w:t>
         <w:tab/>
         <w:t>10</w:t>
       </w:r>
@@ -5627,7 +5627,7 @@
         <w:pStyle w:val="Heading2"/>
       </w:pPr>
       <w:r>
-        <w:t>Topic 3 — Workflow Optimisation, Industry Compliance and Emerging Video Technologies (LU3, Slides 98–137)</w:t>
+        <w:t>Topic 3 — Workflow Optimisation, Industry Compliance and Emerging Video Technologies (LU3, Slides 98–136)</w:t>
       </w:r>
     </w:p>
     <w:tbl>
@@ -9439,7 +9439,7 @@
                 <w:b w:val="0"/>
                 <w:sz w:val="17"/>
               </w:rPr>
-              <w:t>Course summary, practice exam, Q&amp;A, LMS, TRAQOM, briefing for assessment and assessment attendance</w:t>
+              <w:t>Course summary, Q&amp;A, LMS, TRAQOM, briefing for assessment and assessment attendance</w:t>
             </w:r>
           </w:p>
         </w:tc>
@@ -9475,7 +9475,7 @@
                 <w:b w:val="0"/>
                 <w:sz w:val="17"/>
               </w:rPr>
-              <w:t>134–143</w:t>
+              <w:t>134–142</w:t>
             </w:r>
           </w:p>
         </w:tc>

</xml_diff>